<commit_message>
total energy flow updated with rpc. ec100 kurulum için word eklendi. Can okuması için yeni formatta flowlar eklendi.
</commit_message>
<xml_diff>
--- a/Hems-Gateway/ems-communication-jsons/application/nodered-flow-manager/EC100 kurulumunda yapılacaklar.docx
+++ b/Hems-Gateway/ems-communication-jsons/application/nodered-flow-manager/EC100 kurulumunda yapılacaklar.docx
@@ -13,10 +13,10 @@
     <w:p>
       <w:r>
         <w:drawing>
-          <wp:inline distT="0" distB="0" distL="0" distR="0" wp14:anchorId="59585B16" wp14:editId="335BAC92">
-            <wp:extent cx="5760720" cy="4744085"/>
-            <wp:effectExtent l="0" t="0" r="0" b="0"/>
-            <wp:docPr id="1455516469" name="Resim 1" descr="metin, ekran görüntüsü, yazılım, multimedya yazılımı içeren bir resim&#10;&#10;Yapay zeka tarafından oluşturulmuş içerik yanlış olabilir."/>
+          <wp:inline distT="0" distB="0" distL="0" distR="0" wp14:anchorId="523B4274" wp14:editId="517685B9">
+            <wp:extent cx="5760720" cy="5725160"/>
+            <wp:effectExtent l="0" t="0" r="0" b="8890"/>
+            <wp:docPr id="1856875230" name="Resim 1" descr="metin, ekran görüntüsü, yazılım içeren bir resim&#10;&#10;Yapay zeka tarafından oluşturulmuş içerik yanlış olabilir."/>
             <wp:cNvGraphicFramePr>
               <a:graphicFrameLocks xmlns:a="http://schemas.openxmlformats.org/drawingml/2006/main" noChangeAspect="1"/>
             </wp:cNvGraphicFramePr>
@@ -24,7 +24,7 @@
               <a:graphicData uri="http://schemas.openxmlformats.org/drawingml/2006/picture">
                 <pic:pic xmlns:pic="http://schemas.openxmlformats.org/drawingml/2006/picture">
                   <pic:nvPicPr>
-                    <pic:cNvPr id="1455516469" name="Resim 1" descr="metin, ekran görüntüsü, yazılım, multimedya yazılımı içeren bir resim&#10;&#10;Yapay zeka tarafından oluşturulmuş içerik yanlış olabilir."/>
+                    <pic:cNvPr id="1856875230" name="Resim 1" descr="metin, ekran görüntüsü, yazılım içeren bir resim&#10;&#10;Yapay zeka tarafından oluşturulmuş içerik yanlış olabilir."/>
                     <pic:cNvPicPr/>
                   </pic:nvPicPr>
                   <pic:blipFill>
@@ -36,7 +36,7 @@
                   <pic:spPr>
                     <a:xfrm>
                       <a:off x="0" y="0"/>
-                      <a:ext cx="5760720" cy="4744085"/>
+                      <a:ext cx="5760720" cy="5725160"/>
                     </a:xfrm>
                     <a:prstGeom prst="rect">
                       <a:avLst/>
@@ -64,21 +64,71 @@
           <w:szCs w:val="16"/>
         </w:rPr>
       </w:pPr>
-    </w:p>
-    <w:p>
-      <w:pPr>
+      <w:r>
         <w:rPr>
           <w:sz w:val="16"/>
           <w:szCs w:val="16"/>
         </w:rPr>
-      </w:pPr>
-    </w:p>
-    <w:p>
-      <w:r>
+        <w:drawing>
+          <wp:inline distT="0" distB="0" distL="0" distR="0" wp14:anchorId="6257F061" wp14:editId="0A45E1FF">
+            <wp:extent cx="5760720" cy="1298575"/>
+            <wp:effectExtent l="0" t="0" r="0" b="0"/>
+            <wp:docPr id="102325434" name="Resim 1" descr="metin, ekran görüntüsü, yazı tipi içeren bir resim&#10;&#10;Yapay zeka tarafından oluşturulmuş içerik yanlış olabilir."/>
+            <wp:cNvGraphicFramePr>
+              <a:graphicFrameLocks xmlns:a="http://schemas.openxmlformats.org/drawingml/2006/main" noChangeAspect="1"/>
+            </wp:cNvGraphicFramePr>
+            <a:graphic xmlns:a="http://schemas.openxmlformats.org/drawingml/2006/main">
+              <a:graphicData uri="http://schemas.openxmlformats.org/drawingml/2006/picture">
+                <pic:pic xmlns:pic="http://schemas.openxmlformats.org/drawingml/2006/picture">
+                  <pic:nvPicPr>
+                    <pic:cNvPr id="102325434" name="Resim 1" descr="metin, ekran görüntüsü, yazı tipi içeren bir resim&#10;&#10;Yapay zeka tarafından oluşturulmuş içerik yanlış olabilir."/>
+                    <pic:cNvPicPr/>
+                  </pic:nvPicPr>
+                  <pic:blipFill>
+                    <a:blip r:embed="rId9"/>
+                    <a:stretch>
+                      <a:fillRect/>
+                    </a:stretch>
+                  </pic:blipFill>
+                  <pic:spPr>
+                    <a:xfrm>
+                      <a:off x="0" y="0"/>
+                      <a:ext cx="5760720" cy="1298575"/>
+                    </a:xfrm>
+                    <a:prstGeom prst="rect">
+                      <a:avLst/>
+                    </a:prstGeom>
+                  </pic:spPr>
+                </pic:pic>
+              </a:graphicData>
+            </a:graphic>
+          </wp:inline>
+        </w:drawing>
+      </w:r>
+    </w:p>
+    <w:p>
+      <w:pPr>
         <w:rPr>
           <w:sz w:val="16"/>
           <w:szCs w:val="16"/>
         </w:rPr>
+      </w:pPr>
+    </w:p>
+    <w:p>
+      <w:pPr>
+        <w:rPr>
+          <w:sz w:val="16"/>
+          <w:szCs w:val="16"/>
+        </w:rPr>
+      </w:pPr>
+    </w:p>
+    <w:p>
+      <w:r>
+        <w:rPr>
+          <w:sz w:val="16"/>
+          <w:szCs w:val="16"/>
+        </w:rPr>
+        <w:lastRenderedPageBreak/>
         <w:br/>
       </w:r>
       <w:r>
@@ -237,7 +287,6 @@
           <w:lang w:eastAsia="tr-TR"/>
           <w14:ligatures w14:val="none"/>
         </w:rPr>
-        <w:lastRenderedPageBreak/>
         <w:t xml:space="preserve">Adım 1: </w:t>
       </w:r>
       <w:proofErr w:type="spellStart"/>
@@ -635,6 +684,9 @@
         <w:br/>
       </w:r>
       <w:r>
+        <w:rPr>
+          <w:noProof/>
+        </w:rPr>
         <w:drawing>
           <wp:inline distT="0" distB="0" distL="0" distR="0" wp14:anchorId="0BB7BD91" wp14:editId="141D1495">
             <wp:extent cx="2591162" cy="1543265"/>
@@ -651,7 +703,7 @@
                     <pic:cNvPicPr/>
                   </pic:nvPicPr>
                   <pic:blipFill>
-                    <a:blip r:embed="rId9"/>
+                    <a:blip r:embed="rId10"/>
                     <a:stretch>
                       <a:fillRect/>
                     </a:stretch>
@@ -685,6 +737,7 @@
           <w:b/>
           <w:bCs/>
         </w:rPr>
+        <w:lastRenderedPageBreak/>
         <w:t xml:space="preserve">Adım 3: CAN Batarya </w:t>
       </w:r>
       <w:proofErr w:type="spellStart"/>
@@ -899,15 +952,14 @@
         <w:t>4.3.</w:t>
       </w:r>
       <w:r>
-        <w:t xml:space="preserve"> Aşağıdaki bilgileri kontrol edin ve güncelleyin:</w:t>
-      </w:r>
-      <w:r>
-        <w:t xml:space="preserve"> </w:t>
-      </w:r>
-    </w:p>
-    <w:p>
-      <w:r>
-        <w:lastRenderedPageBreak/>
+        <w:t xml:space="preserve"> Aşağıdaki bilgileri kontrol edin ve güncelleyin: </w:t>
+      </w:r>
+    </w:p>
+    <w:p>
+      <w:r>
+        <w:rPr>
+          <w:noProof/>
+        </w:rPr>
         <w:drawing>
           <wp:inline distT="0" distB="0" distL="0" distR="0" wp14:anchorId="5AB888AD" wp14:editId="74603F8B">
             <wp:extent cx="3829381" cy="3647029"/>
@@ -924,7 +976,7 @@
                     <pic:cNvPicPr/>
                   </pic:nvPicPr>
                   <pic:blipFill>
-                    <a:blip r:embed="rId10"/>
+                    <a:blip r:embed="rId11"/>
                     <a:stretch>
                       <a:fillRect/>
                     </a:stretch>
@@ -1020,6 +1072,10 @@
     </w:p>
     <w:p>
       <w:r>
+        <w:rPr>
+          <w:noProof/>
+        </w:rPr>
+        <w:lastRenderedPageBreak/>
         <w:drawing>
           <wp:inline distT="0" distB="0" distL="0" distR="0" wp14:anchorId="324B5423" wp14:editId="0EE77F99">
             <wp:extent cx="3813061" cy="2907052"/>
@@ -1036,7 +1092,7 @@
                     <pic:cNvPicPr/>
                   </pic:nvPicPr>
                   <pic:blipFill>
-                    <a:blip r:embed="rId11"/>
+                    <a:blip r:embed="rId12"/>
                     <a:stretch>
                       <a:fillRect/>
                     </a:stretch>
@@ -1139,6 +1195,134 @@
       </w:r>
     </w:p>
     <w:p/>
+    <w:p>
+      <w:pPr>
+        <w:rPr>
+          <w:b/>
+          <w:bCs/>
+        </w:rPr>
+      </w:pPr>
+      <w:r>
+        <w:rPr>
+          <w:b/>
+          <w:bCs/>
+        </w:rPr>
+        <w:t xml:space="preserve">Adım 5: </w:t>
+      </w:r>
+      <w:proofErr w:type="spellStart"/>
+      <w:r>
+        <w:rPr>
+          <w:b/>
+          <w:bCs/>
+        </w:rPr>
+        <w:t>Flow</w:t>
+      </w:r>
+      <w:proofErr w:type="spellEnd"/>
+      <w:r>
+        <w:rPr>
+          <w:b/>
+          <w:bCs/>
+        </w:rPr>
+        <w:t xml:space="preserve"> Manager </w:t>
+      </w:r>
+      <w:proofErr w:type="spellStart"/>
+      <w:r>
+        <w:rPr>
+          <w:b/>
+          <w:bCs/>
+        </w:rPr>
+        <w:t>Import</w:t>
+      </w:r>
+      <w:proofErr w:type="spellEnd"/>
+    </w:p>
+    <w:p>
+      <w:r>
+        <w:rPr>
+          <w:b/>
+          <w:bCs/>
+        </w:rPr>
+        <w:t>5.1.</w:t>
+      </w:r>
+      <w:r>
+        <w:t xml:space="preserve"> Menüden </w:t>
+      </w:r>
+      <w:proofErr w:type="spellStart"/>
+      <w:r>
+        <w:rPr>
+          <w:b/>
+          <w:bCs/>
+        </w:rPr>
+        <w:t>Import</w:t>
+      </w:r>
+      <w:proofErr w:type="spellEnd"/>
+      <w:r>
+        <w:t xml:space="preserve"> seçeneğine tıklayın</w:t>
+      </w:r>
+    </w:p>
+    <w:p>
+      <w:r>
+        <w:rPr>
+          <w:b/>
+          <w:bCs/>
+        </w:rPr>
+        <w:t>5.2.</w:t>
+      </w:r>
+      <w:r>
+        <w:t xml:space="preserve"> </w:t>
+      </w:r>
+      <w:proofErr w:type="spellStart"/>
+      <w:r>
+        <w:rPr>
+          <w:b/>
+          <w:bCs/>
+        </w:rPr>
+        <w:t>flowManager</w:t>
+      </w:r>
+      <w:proofErr w:type="spellEnd"/>
+      <w:r>
+        <w:t xml:space="preserve"> </w:t>
+      </w:r>
+      <w:proofErr w:type="spellStart"/>
+      <w:r>
+        <w:t>flow</w:t>
+      </w:r>
+      <w:proofErr w:type="spellEnd"/>
+      <w:r>
+        <w:t xml:space="preserve"> dosyasını </w:t>
+      </w:r>
+      <w:proofErr w:type="spellStart"/>
+      <w:r>
+        <w:t>import</w:t>
+      </w:r>
+      <w:proofErr w:type="spellEnd"/>
+      <w:r>
+        <w:t xml:space="preserve"> edin</w:t>
+      </w:r>
+    </w:p>
+    <w:p>
+      <w:r>
+        <w:rPr>
+          <w:b/>
+          <w:bCs/>
+        </w:rPr>
+        <w:t>5.3.</w:t>
+      </w:r>
+      <w:r>
+        <w:t xml:space="preserve"> </w:t>
+      </w:r>
+      <w:proofErr w:type="spellStart"/>
+      <w:r>
+        <w:rPr>
+          <w:b/>
+          <w:bCs/>
+        </w:rPr>
+        <w:t>Deploy</w:t>
+      </w:r>
+      <w:proofErr w:type="spellEnd"/>
+      <w:r>
+        <w:t xml:space="preserve"> butonuna tıklayın</w:t>
+      </w:r>
+    </w:p>
     <w:p/>
     <w:p>
       <w:pPr>
@@ -1152,206 +1336,80 @@
           <w:b/>
           <w:bCs/>
         </w:rPr>
+        <w:t>Adım 6: Desktop Uygulaması Yapılandırması</w:t>
+      </w:r>
+    </w:p>
+    <w:p>
+      <w:r>
+        <w:rPr>
+          <w:b/>
+          <w:bCs/>
+        </w:rPr>
+        <w:t>6.1.</w:t>
+      </w:r>
+      <w:r>
+        <w:t xml:space="preserve"> Bilgisayarınızda </w:t>
+      </w:r>
+      <w:proofErr w:type="spellStart"/>
+      <w:r>
+        <w:rPr>
+          <w:b/>
+          <w:bCs/>
+        </w:rPr>
+        <w:t>Node</w:t>
+      </w:r>
+      <w:proofErr w:type="spellEnd"/>
+      <w:r>
+        <w:rPr>
+          <w:b/>
+          <w:bCs/>
+        </w:rPr>
+        <w:t xml:space="preserve">-RED </w:t>
+      </w:r>
+      <w:proofErr w:type="spellStart"/>
+      <w:r>
+        <w:rPr>
+          <w:b/>
+          <w:bCs/>
+        </w:rPr>
+        <w:t>Flow</w:t>
+      </w:r>
+      <w:proofErr w:type="spellEnd"/>
+      <w:r>
+        <w:rPr>
+          <w:b/>
+          <w:bCs/>
+        </w:rPr>
+        <w:t xml:space="preserve"> Manager Desktop</w:t>
+      </w:r>
+      <w:r>
+        <w:t xml:space="preserve"> uygulamasını açın</w:t>
+      </w:r>
+      <w:r>
+        <w:t>. (BURADAN SONRASI İÇİN ethernet kablosunun bağlı olmasına gerek yok uzaktan yapılabilir.)</w:t>
+      </w:r>
+    </w:p>
+    <w:p>
+      <w:r>
+        <w:rPr>
+          <w:b/>
+          <w:bCs/>
+        </w:rPr>
+        <w:t>6.2.</w:t>
+      </w:r>
+      <w:r>
+        <w:t xml:space="preserve"> Cihaz bağlantı bilgilerini girin:</w:t>
+      </w:r>
+    </w:p>
+    <w:p>
+      <w:r>
         <w:lastRenderedPageBreak/>
-        <w:t xml:space="preserve">Adım 5: </w:t>
-      </w:r>
-      <w:proofErr w:type="spellStart"/>
-      <w:r>
-        <w:rPr>
-          <w:b/>
-          <w:bCs/>
-        </w:rPr>
-        <w:t>Flow</w:t>
-      </w:r>
-      <w:proofErr w:type="spellEnd"/>
-      <w:r>
-        <w:rPr>
-          <w:b/>
-          <w:bCs/>
-        </w:rPr>
-        <w:t xml:space="preserve"> Manager </w:t>
-      </w:r>
-      <w:proofErr w:type="spellStart"/>
-      <w:r>
-        <w:rPr>
-          <w:b/>
-          <w:bCs/>
-        </w:rPr>
-        <w:t>Import</w:t>
-      </w:r>
-      <w:proofErr w:type="spellEnd"/>
-    </w:p>
-    <w:p>
-      <w:r>
-        <w:rPr>
-          <w:b/>
-          <w:bCs/>
-        </w:rPr>
-        <w:t>5.1.</w:t>
-      </w:r>
-      <w:r>
-        <w:t xml:space="preserve"> Menüden </w:t>
-      </w:r>
-      <w:proofErr w:type="spellStart"/>
-      <w:r>
-        <w:rPr>
-          <w:b/>
-          <w:bCs/>
-        </w:rPr>
-        <w:t>Import</w:t>
-      </w:r>
-      <w:proofErr w:type="spellEnd"/>
-      <w:r>
-        <w:t xml:space="preserve"> seçeneğine tıklayın</w:t>
-      </w:r>
-    </w:p>
-    <w:p>
-      <w:r>
-        <w:rPr>
-          <w:b/>
-          <w:bCs/>
-        </w:rPr>
-        <w:t>5.2.</w:t>
-      </w:r>
-      <w:r>
-        <w:t xml:space="preserve"> </w:t>
-      </w:r>
-      <w:proofErr w:type="spellStart"/>
-      <w:r>
-        <w:rPr>
-          <w:b/>
-          <w:bCs/>
-        </w:rPr>
-        <w:t>flowManager</w:t>
-      </w:r>
-      <w:proofErr w:type="spellEnd"/>
-      <w:r>
-        <w:t xml:space="preserve"> </w:t>
-      </w:r>
-      <w:proofErr w:type="spellStart"/>
-      <w:r>
-        <w:t>flow</w:t>
-      </w:r>
-      <w:proofErr w:type="spellEnd"/>
-      <w:r>
-        <w:t xml:space="preserve"> dosyasını </w:t>
-      </w:r>
-      <w:proofErr w:type="spellStart"/>
-      <w:r>
-        <w:t>import</w:t>
-      </w:r>
-      <w:proofErr w:type="spellEnd"/>
-      <w:r>
-        <w:t xml:space="preserve"> edin</w:t>
-      </w:r>
-    </w:p>
-    <w:p>
-      <w:r>
-        <w:rPr>
-          <w:b/>
-          <w:bCs/>
-        </w:rPr>
-        <w:t>5.3.</w:t>
-      </w:r>
-      <w:r>
-        <w:t xml:space="preserve"> </w:t>
-      </w:r>
-      <w:proofErr w:type="spellStart"/>
-      <w:r>
-        <w:rPr>
-          <w:b/>
-          <w:bCs/>
-        </w:rPr>
-        <w:t>Deploy</w:t>
-      </w:r>
-      <w:proofErr w:type="spellEnd"/>
-      <w:r>
-        <w:t xml:space="preserve"> butonuna tıklayın</w:t>
-      </w:r>
-    </w:p>
-    <w:p/>
-    <w:p>
-      <w:pPr>
-        <w:rPr>
-          <w:b/>
-          <w:bCs/>
-        </w:rPr>
-      </w:pPr>
-      <w:r>
-        <w:rPr>
-          <w:b/>
-          <w:bCs/>
-        </w:rPr>
-        <w:t>Adım 6: Desktop Uygulaması Yapılandırması</w:t>
-      </w:r>
-    </w:p>
-    <w:p>
-      <w:r>
-        <w:rPr>
-          <w:b/>
-          <w:bCs/>
-        </w:rPr>
-        <w:t>6.1.</w:t>
-      </w:r>
-      <w:r>
-        <w:t xml:space="preserve"> Bilgisayarınızda </w:t>
-      </w:r>
-      <w:proofErr w:type="spellStart"/>
-      <w:r>
-        <w:rPr>
-          <w:b/>
-          <w:bCs/>
-        </w:rPr>
-        <w:t>Node</w:t>
-      </w:r>
-      <w:proofErr w:type="spellEnd"/>
-      <w:r>
-        <w:rPr>
-          <w:b/>
-          <w:bCs/>
-        </w:rPr>
-        <w:t xml:space="preserve">-RED </w:t>
-      </w:r>
-      <w:proofErr w:type="spellStart"/>
-      <w:r>
-        <w:rPr>
-          <w:b/>
-          <w:bCs/>
-        </w:rPr>
-        <w:t>Flow</w:t>
-      </w:r>
-      <w:proofErr w:type="spellEnd"/>
-      <w:r>
-        <w:rPr>
-          <w:b/>
-          <w:bCs/>
-        </w:rPr>
-        <w:t xml:space="preserve"> Manager Desktop</w:t>
-      </w:r>
-      <w:r>
-        <w:t xml:space="preserve"> uygulamasını açın</w:t>
-      </w:r>
-      <w:r>
-        <w:t>. (BURADAN SONRASI İÇİN ethernet kablosunun bağlı olmasına gerek yok uzaktan yapılabilir.)</w:t>
-      </w:r>
-    </w:p>
-    <w:p>
-      <w:r>
-        <w:rPr>
-          <w:b/>
-          <w:bCs/>
-        </w:rPr>
-        <w:t>6.2.</w:t>
-      </w:r>
-      <w:r>
-        <w:t xml:space="preserve"> Cihaz bağlantı bilgilerini girin:</w:t>
-      </w:r>
-    </w:p>
-    <w:p>
-      <w:r>
         <w:br/>
       </w:r>
       <w:r>
+        <w:rPr>
+          <w:noProof/>
+        </w:rPr>
         <w:drawing>
           <wp:inline distT="0" distB="0" distL="0" distR="0" wp14:anchorId="1A368889" wp14:editId="2F63429D">
             <wp:extent cx="5760720" cy="4369253"/>
@@ -1368,7 +1426,7 @@
                     <pic:cNvPicPr/>
                   </pic:nvPicPr>
                   <pic:blipFill>
-                    <a:blip r:embed="rId12"/>
+                    <a:blip r:embed="rId13"/>
                     <a:stretch>
                       <a:fillRect/>
                     </a:stretch>
@@ -1404,10 +1462,367 @@
         <w:t>.</w:t>
       </w:r>
     </w:p>
+    <w:p>
+      <w:pPr>
+        <w:rPr>
+          <w:b/>
+          <w:bCs/>
+        </w:rPr>
+      </w:pPr>
+      <w:r>
+        <w:rPr>
+          <w:b/>
+          <w:bCs/>
+        </w:rPr>
+        <w:t xml:space="preserve">Adım 7: Geçici SOC </w:t>
+      </w:r>
+      <w:proofErr w:type="spellStart"/>
+      <w:r>
+        <w:rPr>
+          <w:b/>
+          <w:bCs/>
+        </w:rPr>
+        <w:t>Flow'unun</w:t>
+      </w:r>
+      <w:proofErr w:type="spellEnd"/>
+      <w:r>
+        <w:rPr>
+          <w:b/>
+          <w:bCs/>
+        </w:rPr>
+        <w:t xml:space="preserve"> Silinmesi</w:t>
+      </w:r>
+    </w:p>
+    <w:p>
+      <w:r>
+        <w:rPr>
+          <w:b/>
+          <w:bCs/>
+        </w:rPr>
+        <w:t>7.1.</w:t>
+      </w:r>
+      <w:r>
+        <w:t xml:space="preserve"> </w:t>
+      </w:r>
+      <w:proofErr w:type="spellStart"/>
+      <w:r>
+        <w:t>Node</w:t>
+      </w:r>
+      <w:proofErr w:type="spellEnd"/>
+      <w:r>
+        <w:t xml:space="preserve">-RED arayüzünde </w:t>
+      </w:r>
+      <w:r>
+        <w:rPr>
+          <w:b/>
+          <w:bCs/>
+        </w:rPr>
+        <w:t>SOC</w:t>
+      </w:r>
+      <w:r>
+        <w:t xml:space="preserve"> </w:t>
+      </w:r>
+      <w:proofErr w:type="spellStart"/>
+      <w:r>
+        <w:t>flow</w:t>
+      </w:r>
+      <w:proofErr w:type="spellEnd"/>
+      <w:r>
+        <w:t xml:space="preserve"> sekmesine sağ tıklayın</w:t>
+      </w:r>
+    </w:p>
+    <w:p>
+      <w:r>
+        <w:rPr>
+          <w:b/>
+          <w:bCs/>
+        </w:rPr>
+        <w:t>7.2.</w:t>
+      </w:r>
+      <w:r>
+        <w:t xml:space="preserve"> </w:t>
+      </w:r>
+      <w:proofErr w:type="spellStart"/>
+      <w:r>
+        <w:rPr>
+          <w:b/>
+          <w:bCs/>
+        </w:rPr>
+        <w:t>Delete</w:t>
+      </w:r>
+      <w:proofErr w:type="spellEnd"/>
+      <w:r>
+        <w:t xml:space="preserve"> seçeneğini seçin</w:t>
+      </w:r>
+    </w:p>
+    <w:p>
+      <w:r>
+        <w:rPr>
+          <w:b/>
+          <w:bCs/>
+        </w:rPr>
+        <w:t>7.3.</w:t>
+      </w:r>
+      <w:r>
+        <w:t xml:space="preserve"> </w:t>
+      </w:r>
+      <w:proofErr w:type="spellStart"/>
+      <w:r>
+        <w:rPr>
+          <w:b/>
+          <w:bCs/>
+        </w:rPr>
+        <w:t>Deploy</w:t>
+      </w:r>
+      <w:proofErr w:type="spellEnd"/>
+      <w:r>
+        <w:t xml:space="preserve"> butonuna tıklayın</w:t>
+      </w:r>
+    </w:p>
+    <w:p>
+      <w:r>
+        <w:rPr>
+          <w:rFonts w:ascii="Segoe UI Emoji" w:hAnsi="Segoe UI Emoji" w:cs="Segoe UI Emoji"/>
+        </w:rPr>
+        <w:t>⚠️</w:t>
+      </w:r>
+      <w:r>
+        <w:t xml:space="preserve"> </w:t>
+      </w:r>
+      <w:r>
+        <w:rPr>
+          <w:b/>
+          <w:bCs/>
+        </w:rPr>
+        <w:t>ÖNEMLİ:</w:t>
+      </w:r>
+      <w:r>
+        <w:t xml:space="preserve"> Bu adım atlanmamalıdır! SOC </w:t>
+      </w:r>
+      <w:proofErr w:type="spellStart"/>
+      <w:r>
+        <w:t>flow'u</w:t>
+      </w:r>
+      <w:proofErr w:type="spellEnd"/>
+      <w:r>
+        <w:t xml:space="preserve"> silinmezse, sonradan </w:t>
+      </w:r>
+      <w:proofErr w:type="spellStart"/>
+      <w:r>
+        <w:t>import</w:t>
+      </w:r>
+      <w:proofErr w:type="spellEnd"/>
+      <w:r>
+        <w:t xml:space="preserve"> edilen </w:t>
+      </w:r>
+      <w:proofErr w:type="spellStart"/>
+      <w:r>
+        <w:t>flow'lar</w:t>
+      </w:r>
+      <w:proofErr w:type="spellEnd"/>
+      <w:r>
+        <w:t xml:space="preserve"> RPC tetikleyicilerine doğru şekilde bağlanamaz.</w:t>
+      </w:r>
+    </w:p>
     <w:p/>
+    <w:p>
+      <w:pPr>
+        <w:rPr>
+          <w:b/>
+          <w:bCs/>
+        </w:rPr>
+      </w:pPr>
+      <w:r>
+        <w:rPr>
+          <w:b/>
+          <w:bCs/>
+        </w:rPr>
+        <w:t xml:space="preserve">Adım 8: RPC </w:t>
+      </w:r>
+      <w:proofErr w:type="spellStart"/>
+      <w:r>
+        <w:rPr>
+          <w:b/>
+          <w:bCs/>
+        </w:rPr>
+        <w:t>Flow'larının</w:t>
+      </w:r>
+      <w:proofErr w:type="spellEnd"/>
+      <w:r>
+        <w:rPr>
+          <w:b/>
+          <w:bCs/>
+        </w:rPr>
+        <w:t xml:space="preserve"> </w:t>
+      </w:r>
+      <w:proofErr w:type="spellStart"/>
+      <w:r>
+        <w:rPr>
+          <w:b/>
+          <w:bCs/>
+        </w:rPr>
+        <w:t>Import</w:t>
+      </w:r>
+      <w:proofErr w:type="spellEnd"/>
+      <w:r>
+        <w:rPr>
+          <w:b/>
+          <w:bCs/>
+        </w:rPr>
+        <w:t xml:space="preserve"> Edilmesi</w:t>
+      </w:r>
+    </w:p>
+    <w:p>
+      <w:r>
+        <w:rPr>
+          <w:b/>
+          <w:bCs/>
+        </w:rPr>
+        <w:t>8.1.</w:t>
+      </w:r>
+      <w:r>
+        <w:t xml:space="preserve"> </w:t>
+      </w:r>
+      <w:proofErr w:type="spellStart"/>
+      <w:r>
+        <w:t>Flow</w:t>
+      </w:r>
+      <w:proofErr w:type="spellEnd"/>
+      <w:r>
+        <w:t xml:space="preserve"> Manager Desktop uygulamasından </w:t>
+      </w:r>
+      <w:r>
+        <w:rPr>
+          <w:b/>
+          <w:bCs/>
+        </w:rPr>
+        <w:t xml:space="preserve">RPC </w:t>
+      </w:r>
+      <w:proofErr w:type="spellStart"/>
+      <w:r>
+        <w:rPr>
+          <w:b/>
+          <w:bCs/>
+        </w:rPr>
+        <w:t>flow'larını</w:t>
+      </w:r>
+      <w:proofErr w:type="spellEnd"/>
+      <w:r>
+        <w:t xml:space="preserve"> </w:t>
+      </w:r>
+      <w:proofErr w:type="spellStart"/>
+      <w:r>
+        <w:t>import</w:t>
+      </w:r>
+      <w:proofErr w:type="spellEnd"/>
+      <w:r>
+        <w:t xml:space="preserve"> edin</w:t>
+      </w:r>
+    </w:p>
+    <w:p>
+      <w:r>
+        <w:rPr>
+          <w:b/>
+          <w:bCs/>
+        </w:rPr>
+        <w:t>8.2.</w:t>
+      </w:r>
+      <w:r>
+        <w:t xml:space="preserve"> Tüm RPC </w:t>
+      </w:r>
+      <w:proofErr w:type="spellStart"/>
+      <w:r>
+        <w:t>flow'ları</w:t>
+      </w:r>
+      <w:proofErr w:type="spellEnd"/>
+      <w:r>
+        <w:t xml:space="preserve"> yüklendikten sonra </w:t>
+      </w:r>
+      <w:proofErr w:type="spellStart"/>
+      <w:r>
+        <w:t>Node-RED'de</w:t>
+      </w:r>
+      <w:proofErr w:type="spellEnd"/>
+      <w:r>
+        <w:t xml:space="preserve"> </w:t>
+      </w:r>
+      <w:proofErr w:type="spellStart"/>
+      <w:r>
+        <w:rPr>
+          <w:b/>
+          <w:bCs/>
+        </w:rPr>
+        <w:t>Deploy</w:t>
+      </w:r>
+      <w:proofErr w:type="spellEnd"/>
+      <w:r>
+        <w:t xml:space="preserve"> yapın</w:t>
+      </w:r>
+    </w:p>
+    <w:p>
+      <w:r>
+        <w:rPr>
+          <w:rFonts w:ascii="Segoe UI Emoji" w:hAnsi="Segoe UI Emoji" w:cs="Segoe UI Emoji"/>
+        </w:rPr>
+        <w:t>⚠️</w:t>
+      </w:r>
+      <w:r>
+        <w:t xml:space="preserve"> </w:t>
+      </w:r>
+      <w:r>
+        <w:rPr>
+          <w:b/>
+          <w:bCs/>
+        </w:rPr>
+        <w:t>ÖNEMLİ:</w:t>
+      </w:r>
+      <w:r>
+        <w:t xml:space="preserve"> RPC </w:t>
+      </w:r>
+      <w:proofErr w:type="spellStart"/>
+      <w:r>
+        <w:t>flow'ları</w:t>
+      </w:r>
+      <w:proofErr w:type="spellEnd"/>
+      <w:r>
+        <w:t xml:space="preserve">, </w:t>
+      </w:r>
+      <w:proofErr w:type="spellStart"/>
+      <w:r>
+        <w:t>Telemetry</w:t>
+      </w:r>
+      <w:proofErr w:type="spellEnd"/>
+      <w:r>
+        <w:t xml:space="preserve"> </w:t>
+      </w:r>
+      <w:proofErr w:type="spellStart"/>
+      <w:r>
+        <w:t>flow'larından</w:t>
+      </w:r>
+      <w:proofErr w:type="spellEnd"/>
+      <w:r>
+        <w:t xml:space="preserve"> </w:t>
+      </w:r>
+      <w:r>
+        <w:rPr>
+          <w:b/>
+          <w:bCs/>
+        </w:rPr>
+        <w:t>önce</w:t>
+      </w:r>
+      <w:r>
+        <w:t xml:space="preserve"> </w:t>
+      </w:r>
+      <w:proofErr w:type="spellStart"/>
+      <w:r>
+        <w:t>import</w:t>
+      </w:r>
+      <w:proofErr w:type="spellEnd"/>
+      <w:r>
+        <w:t xml:space="preserve"> edilmelidir. Aksi takdirde tetikleyici bağlantıları düzgün oluşmaz.</w:t>
+      </w:r>
+    </w:p>
     <w:p/>
-    <w:p/>
-    <w:p/>
     <w:p>
       <w:pPr>
         <w:rPr>
@@ -1420,367 +1835,7 @@
           <w:b/>
           <w:bCs/>
         </w:rPr>
-        <w:t xml:space="preserve">Adım 7: Geçici SOC </w:t>
-      </w:r>
-      <w:proofErr w:type="spellStart"/>
-      <w:r>
-        <w:rPr>
-          <w:b/>
-          <w:bCs/>
-        </w:rPr>
-        <w:t>Flow'unun</w:t>
-      </w:r>
-      <w:proofErr w:type="spellEnd"/>
-      <w:r>
-        <w:rPr>
-          <w:b/>
-          <w:bCs/>
-        </w:rPr>
-        <w:t xml:space="preserve"> Silinmesi</w:t>
-      </w:r>
-    </w:p>
-    <w:p>
-      <w:r>
-        <w:rPr>
-          <w:b/>
-          <w:bCs/>
-        </w:rPr>
-        <w:t>7.1.</w:t>
-      </w:r>
-      <w:r>
-        <w:t xml:space="preserve"> </w:t>
-      </w:r>
-      <w:proofErr w:type="spellStart"/>
-      <w:r>
-        <w:t>Node</w:t>
-      </w:r>
-      <w:proofErr w:type="spellEnd"/>
-      <w:r>
-        <w:t xml:space="preserve">-RED arayüzünde </w:t>
-      </w:r>
-      <w:r>
-        <w:rPr>
-          <w:b/>
-          <w:bCs/>
-        </w:rPr>
-        <w:t>SOC</w:t>
-      </w:r>
-      <w:r>
-        <w:t xml:space="preserve"> </w:t>
-      </w:r>
-      <w:proofErr w:type="spellStart"/>
-      <w:r>
-        <w:t>flow</w:t>
-      </w:r>
-      <w:proofErr w:type="spellEnd"/>
-      <w:r>
-        <w:t xml:space="preserve"> sekmesine sağ tıklayın</w:t>
-      </w:r>
-    </w:p>
-    <w:p>
-      <w:r>
-        <w:rPr>
-          <w:b/>
-          <w:bCs/>
-        </w:rPr>
-        <w:t>7.2.</w:t>
-      </w:r>
-      <w:r>
-        <w:t xml:space="preserve"> </w:t>
-      </w:r>
-      <w:proofErr w:type="spellStart"/>
-      <w:r>
-        <w:rPr>
-          <w:b/>
-          <w:bCs/>
-        </w:rPr>
-        <w:t>Delete</w:t>
-      </w:r>
-      <w:proofErr w:type="spellEnd"/>
-      <w:r>
-        <w:t xml:space="preserve"> seçeneğini seçin</w:t>
-      </w:r>
-    </w:p>
-    <w:p>
-      <w:r>
-        <w:rPr>
-          <w:b/>
-          <w:bCs/>
-        </w:rPr>
-        <w:t>7.3.</w:t>
-      </w:r>
-      <w:r>
-        <w:t xml:space="preserve"> </w:t>
-      </w:r>
-      <w:proofErr w:type="spellStart"/>
-      <w:r>
-        <w:rPr>
-          <w:b/>
-          <w:bCs/>
-        </w:rPr>
-        <w:t>Deploy</w:t>
-      </w:r>
-      <w:proofErr w:type="spellEnd"/>
-      <w:r>
-        <w:t xml:space="preserve"> butonuna tıklayın</w:t>
-      </w:r>
-    </w:p>
-    <w:p>
-      <w:r>
-        <w:rPr>
-          <w:rFonts w:ascii="Segoe UI Emoji" w:hAnsi="Segoe UI Emoji" w:cs="Segoe UI Emoji"/>
-        </w:rPr>
-        <w:t>⚠️</w:t>
-      </w:r>
-      <w:r>
-        <w:t xml:space="preserve"> </w:t>
-      </w:r>
-      <w:r>
-        <w:rPr>
-          <w:b/>
-          <w:bCs/>
-        </w:rPr>
-        <w:t>ÖNEMLİ:</w:t>
-      </w:r>
-      <w:r>
-        <w:t xml:space="preserve"> Bu adım atlanmamalıdır! SOC </w:t>
-      </w:r>
-      <w:proofErr w:type="spellStart"/>
-      <w:r>
-        <w:t>flow'u</w:t>
-      </w:r>
-      <w:proofErr w:type="spellEnd"/>
-      <w:r>
-        <w:t xml:space="preserve"> silinmezse, sonradan </w:t>
-      </w:r>
-      <w:proofErr w:type="spellStart"/>
-      <w:r>
-        <w:t>import</w:t>
-      </w:r>
-      <w:proofErr w:type="spellEnd"/>
-      <w:r>
-        <w:t xml:space="preserve"> edilen </w:t>
-      </w:r>
-      <w:proofErr w:type="spellStart"/>
-      <w:r>
-        <w:t>flow'lar</w:t>
-      </w:r>
-      <w:proofErr w:type="spellEnd"/>
-      <w:r>
-        <w:t xml:space="preserve"> RPC tetikleyicilerine doğru şekilde bağlanamaz.</w:t>
-      </w:r>
-    </w:p>
-    <w:p/>
-    <w:p>
-      <w:pPr>
-        <w:rPr>
-          <w:b/>
-          <w:bCs/>
-        </w:rPr>
-      </w:pPr>
-      <w:r>
-        <w:rPr>
-          <w:b/>
-          <w:bCs/>
-        </w:rPr>
-        <w:t xml:space="preserve">Adım 8: RPC </w:t>
-      </w:r>
-      <w:proofErr w:type="spellStart"/>
-      <w:r>
-        <w:rPr>
-          <w:b/>
-          <w:bCs/>
-        </w:rPr>
-        <w:t>Flow'larının</w:t>
-      </w:r>
-      <w:proofErr w:type="spellEnd"/>
-      <w:r>
-        <w:rPr>
-          <w:b/>
-          <w:bCs/>
-        </w:rPr>
-        <w:t xml:space="preserve"> </w:t>
-      </w:r>
-      <w:proofErr w:type="spellStart"/>
-      <w:r>
-        <w:rPr>
-          <w:b/>
-          <w:bCs/>
-        </w:rPr>
-        <w:t>Import</w:t>
-      </w:r>
-      <w:proofErr w:type="spellEnd"/>
-      <w:r>
-        <w:rPr>
-          <w:b/>
-          <w:bCs/>
-        </w:rPr>
-        <w:t xml:space="preserve"> Edilmesi</w:t>
-      </w:r>
-    </w:p>
-    <w:p>
-      <w:r>
-        <w:rPr>
-          <w:b/>
-          <w:bCs/>
-        </w:rPr>
-        <w:t>8.1.</w:t>
-      </w:r>
-      <w:r>
-        <w:t xml:space="preserve"> </w:t>
-      </w:r>
-      <w:proofErr w:type="spellStart"/>
-      <w:r>
-        <w:t>Flow</w:t>
-      </w:r>
-      <w:proofErr w:type="spellEnd"/>
-      <w:r>
-        <w:t xml:space="preserve"> Manager Desktop uygulamasından </w:t>
-      </w:r>
-      <w:r>
-        <w:rPr>
-          <w:b/>
-          <w:bCs/>
-        </w:rPr>
-        <w:t xml:space="preserve">RPC </w:t>
-      </w:r>
-      <w:proofErr w:type="spellStart"/>
-      <w:r>
-        <w:rPr>
-          <w:b/>
-          <w:bCs/>
-        </w:rPr>
-        <w:t>flow'larını</w:t>
-      </w:r>
-      <w:proofErr w:type="spellEnd"/>
-      <w:r>
-        <w:t xml:space="preserve"> </w:t>
-      </w:r>
-      <w:proofErr w:type="spellStart"/>
-      <w:r>
-        <w:t>import</w:t>
-      </w:r>
-      <w:proofErr w:type="spellEnd"/>
-      <w:r>
-        <w:t xml:space="preserve"> edin</w:t>
-      </w:r>
-    </w:p>
-    <w:p>
-      <w:r>
-        <w:rPr>
-          <w:b/>
-          <w:bCs/>
-        </w:rPr>
-        <w:t>8.2.</w:t>
-      </w:r>
-      <w:r>
-        <w:t xml:space="preserve"> Tüm RPC </w:t>
-      </w:r>
-      <w:proofErr w:type="spellStart"/>
-      <w:r>
-        <w:t>flow'ları</w:t>
-      </w:r>
-      <w:proofErr w:type="spellEnd"/>
-      <w:r>
-        <w:t xml:space="preserve"> yüklendikten sonra </w:t>
-      </w:r>
-      <w:proofErr w:type="spellStart"/>
-      <w:r>
-        <w:t>Node-RED'de</w:t>
-      </w:r>
-      <w:proofErr w:type="spellEnd"/>
-      <w:r>
-        <w:t xml:space="preserve"> </w:t>
-      </w:r>
-      <w:proofErr w:type="spellStart"/>
-      <w:r>
-        <w:rPr>
-          <w:b/>
-          <w:bCs/>
-        </w:rPr>
-        <w:t>Deploy</w:t>
-      </w:r>
-      <w:proofErr w:type="spellEnd"/>
-      <w:r>
-        <w:t xml:space="preserve"> yapın</w:t>
-      </w:r>
-    </w:p>
-    <w:p>
-      <w:r>
-        <w:rPr>
-          <w:rFonts w:ascii="Segoe UI Emoji" w:hAnsi="Segoe UI Emoji" w:cs="Segoe UI Emoji"/>
-        </w:rPr>
-        <w:t>⚠️</w:t>
-      </w:r>
-      <w:r>
-        <w:t xml:space="preserve"> </w:t>
-      </w:r>
-      <w:r>
-        <w:rPr>
-          <w:b/>
-          <w:bCs/>
-        </w:rPr>
-        <w:t>ÖNEMLİ:</w:t>
-      </w:r>
-      <w:r>
-        <w:t xml:space="preserve"> RPC </w:t>
-      </w:r>
-      <w:proofErr w:type="spellStart"/>
-      <w:r>
-        <w:t>flow'ları</w:t>
-      </w:r>
-      <w:proofErr w:type="spellEnd"/>
-      <w:r>
-        <w:t xml:space="preserve">, </w:t>
-      </w:r>
-      <w:proofErr w:type="spellStart"/>
-      <w:r>
-        <w:t>Telemetry</w:t>
-      </w:r>
-      <w:proofErr w:type="spellEnd"/>
-      <w:r>
-        <w:t xml:space="preserve"> </w:t>
-      </w:r>
-      <w:proofErr w:type="spellStart"/>
-      <w:r>
-        <w:t>flow'larından</w:t>
-      </w:r>
-      <w:proofErr w:type="spellEnd"/>
-      <w:r>
-        <w:t xml:space="preserve"> </w:t>
-      </w:r>
-      <w:r>
-        <w:rPr>
-          <w:b/>
-          <w:bCs/>
-        </w:rPr>
-        <w:t>önce</w:t>
-      </w:r>
-      <w:r>
-        <w:t xml:space="preserve"> </w:t>
-      </w:r>
-      <w:proofErr w:type="spellStart"/>
-      <w:r>
-        <w:t>import</w:t>
-      </w:r>
-      <w:proofErr w:type="spellEnd"/>
-      <w:r>
-        <w:t xml:space="preserve"> edilmelidir. Aksi takdirde tetikleyici bağlantıları düzgün oluşmaz.</w:t>
-      </w:r>
-    </w:p>
-    <w:p/>
-    <w:p>
-      <w:pPr>
-        <w:rPr>
-          <w:b/>
-          <w:bCs/>
-        </w:rPr>
-      </w:pPr>
-      <w:r>
-        <w:rPr>
-          <w:b/>
-          <w:bCs/>
-        </w:rPr>
+        <w:lastRenderedPageBreak/>
         <w:t xml:space="preserve">Adım 9: </w:t>
       </w:r>
       <w:proofErr w:type="spellStart"/>
@@ -2708,6 +2763,7 @@
   <w:style w:type="character" w:default="1" w:styleId="VarsaylanParagrafYazTipi">
     <w:name w:val="Default Paragraph Font"/>
     <w:uiPriority w:val="1"/>
+    <w:semiHidden/>
     <w:unhideWhenUsed/>
   </w:style>
   <w:style w:type="table" w:default="1" w:styleId="NormalTablo">
@@ -3353,6 +3409,15 @@
 </file>
 
 <file path=customXml/item1.xml><?xml version="1.0" encoding="utf-8"?>
+<?mso-contentType ?>
+<FormTemplates xmlns="http://schemas.microsoft.com/sharepoint/v3/contenttype/forms">
+  <Display>DocumentLibraryForm</Display>
+  <Edit>DocumentLibraryForm</Edit>
+  <New>DocumentLibraryForm</New>
+</FormTemplates>
+</file>
+
+<file path=customXml/item2.xml><?xml version="1.0" encoding="utf-8"?>
 <ct:contentTypeSchema xmlns:ct="http://schemas.microsoft.com/office/2006/metadata/contentType" xmlns:ma="http://schemas.microsoft.com/office/2006/metadata/properties/metaAttributes" ct:_="" ma:_="" ma:contentTypeName="Document" ma:contentTypeID="0x010100054F4A04F9EB0849BF2961D8236B347D" ma:contentTypeVersion="10" ma:contentTypeDescription="Create a new document." ma:contentTypeScope="" ma:versionID="68883b15fc7162d3f9024ffeea705260">
   <xsd:schema xmlns:xsd="http://www.w3.org/2001/XMLSchema" xmlns:xs="http://www.w3.org/2001/XMLSchema" xmlns:p="http://schemas.microsoft.com/office/2006/metadata/properties" xmlns:ns3="b82d8cb3-7475-48ab-adb1-33f912c86452" targetNamespace="http://schemas.microsoft.com/office/2006/metadata/properties" ma:root="true" ma:fieldsID="2cbd4c74b1d15917afb96f14ec09f401" ns3:_="">
     <xsd:import namespace="b82d8cb3-7475-48ab-adb1-33f912c86452"/>
@@ -3532,15 +3597,6 @@
 </ct:contentTypeSchema>
 </file>
 
-<file path=customXml/item2.xml><?xml version="1.0" encoding="utf-8"?>
-<?mso-contentType ?>
-<FormTemplates xmlns="http://schemas.microsoft.com/sharepoint/v3/contenttype/forms">
-  <Display>DocumentLibraryForm</Display>
-  <Edit>DocumentLibraryForm</Edit>
-  <New>DocumentLibraryForm</New>
-</FormTemplates>
-</file>
-
 <file path=customXml/item3.xml><?xml version="1.0" encoding="utf-8"?>
 <p:properties xmlns:p="http://schemas.microsoft.com/office/2006/metadata/properties" xmlns:xsi="http://www.w3.org/2001/XMLSchema-instance" xmlns:pc="http://schemas.microsoft.com/office/infopath/2007/PartnerControls">
   <documentManagement>
@@ -3550,6 +3606,14 @@
 </file>
 
 <file path=customXml/itemProps1.xml><?xml version="1.0" encoding="utf-8"?>
+<ds:datastoreItem xmlns:ds="http://schemas.openxmlformats.org/officeDocument/2006/customXml" ds:itemID="{0E40CCD0-5F6E-478C-9CE9-B472FAA2D015}">
+  <ds:schemaRefs>
+    <ds:schemaRef ds:uri="http://schemas.microsoft.com/sharepoint/v3/contenttype/forms"/>
+  </ds:schemaRefs>
+</ds:datastoreItem>
+</file>
+
+<file path=customXml/itemProps2.xml><?xml version="1.0" encoding="utf-8"?>
 <ds:datastoreItem xmlns:ds="http://schemas.openxmlformats.org/officeDocument/2006/customXml" ds:itemID="{D7C6FCC4-10F8-4067-AADA-B17D38C6DA72}">
   <ds:schemaRefs>
     <ds:schemaRef ds:uri="http://schemas.microsoft.com/office/2006/metadata/contentType"/>
@@ -3567,26 +3631,12 @@
 </ds:datastoreItem>
 </file>
 
-<file path=customXml/itemProps2.xml><?xml version="1.0" encoding="utf-8"?>
-<ds:datastoreItem xmlns:ds="http://schemas.openxmlformats.org/officeDocument/2006/customXml" ds:itemID="{0E40CCD0-5F6E-478C-9CE9-B472FAA2D015}">
-  <ds:schemaRefs>
-    <ds:schemaRef ds:uri="http://schemas.microsoft.com/sharepoint/v3/contenttype/forms"/>
-  </ds:schemaRefs>
-</ds:datastoreItem>
-</file>
-
 <file path=customXml/itemProps3.xml><?xml version="1.0" encoding="utf-8"?>
 <ds:datastoreItem xmlns:ds="http://schemas.openxmlformats.org/officeDocument/2006/customXml" ds:itemID="{965AD74B-EDD6-45B6-9A05-A2FCA2AF5E7A}">
   <ds:schemaRefs>
-    <ds:schemaRef ds:uri="http://schemas.microsoft.com/office/2006/documentManagement/types"/>
-    <ds:schemaRef ds:uri="http://schemas.openxmlformats.org/package/2006/metadata/core-properties"/>
-    <ds:schemaRef ds:uri="http://purl.org/dc/elements/1.1/"/>
-    <ds:schemaRef ds:uri="http://purl.org/dc/terms/"/>
-    <ds:schemaRef ds:uri="http://purl.org/dc/dcmitype/"/>
     <ds:schemaRef ds:uri="http://schemas.microsoft.com/office/2006/metadata/properties"/>
+    <ds:schemaRef ds:uri="http://schemas.microsoft.com/office/infopath/2007/PartnerControls"/>
     <ds:schemaRef ds:uri="b82d8cb3-7475-48ab-adb1-33f912c86452"/>
-    <ds:schemaRef ds:uri="http://schemas.microsoft.com/office/infopath/2007/PartnerControls"/>
-    <ds:schemaRef ds:uri="http://www.w3.org/XML/1998/namespace"/>
   </ds:schemaRefs>
 </ds:datastoreItem>
 </file>
</xml_diff>